<commit_message>
Criou a leitura de dados
</commit_message>
<xml_diff>
--- a/calculadora.txt.docx
+++ b/calculadora.txt.docx
@@ -6,8 +6,16 @@
       <w:r>
         <w:t>Declarações de variáveis</w:t>
       </w:r>
+    </w:p>
+    <w:p>
+      <w:r>
+        <w:t>Leitura de entradas</w:t>
+      </w:r>
       <w:bookmarkStart w:id="0" w:name="_GoBack"/>
       <w:bookmarkEnd w:id="0"/>
+      <w:r>
+        <w:t xml:space="preserve"> do programa</w:t>
+      </w:r>
     </w:p>
     <w:sectPr>
       <w:pgSz w:w="11906" w:h="16838"/>

</xml_diff>

<commit_message>
Criou a função soma
</commit_message>
<xml_diff>
--- a/calculadora.txt.docx
+++ b/calculadora.txt.docx
@@ -9,13 +9,15 @@
     </w:p>
     <w:p>
       <w:r>
-        <w:t>Leitura de entradas</w:t>
+        <w:t>Leitura de entradas do programa</w:t>
+      </w:r>
+    </w:p>
+    <w:p>
+      <w:r>
+        <w:t>Criação da função soma</w:t>
       </w:r>
       <w:bookmarkStart w:id="0" w:name="_GoBack"/>
       <w:bookmarkEnd w:id="0"/>
-      <w:r>
-        <w:t xml:space="preserve"> do programa</w:t>
-      </w:r>
     </w:p>
     <w:sectPr>
       <w:pgSz w:w="11906" w:h="16838"/>

</xml_diff>